<commit_message>
Actualizar informe APA de unidad 2
</commit_message>
<xml_diff>
--- a/docs/Informe_Unidad_2_Restaurante_APA.docx
+++ b/docs/Informe_Unidad_2_Restaurante_APA.docx
@@ -166,18 +166,8 @@
           <w:szCs w:val="24"/>
           <w:lang w:val="es-CO"/>
         </w:rPr>
-        <w:t xml:space="preserve">JHON ARRIETA </w:t>
+        <w:t>JHON ARRIETA ARRIETA</w:t>
       </w:r>
-      <w:proofErr w:type="spellStart"/>
-      <w:r>
-        <w:rPr>
-          <w:rFonts w:cs="Times New Roman"/>
-          <w:szCs w:val="24"/>
-          <w:lang w:val="es-CO"/>
-        </w:rPr>
-        <w:t>ARRIETA</w:t>
-      </w:r>
-      <w:proofErr w:type="spellEnd"/>
     </w:p>
     <w:p>
       <w:pPr>
@@ -343,25 +333,7 @@
           <w:szCs w:val="24"/>
           <w:lang w:val="es-CO"/>
         </w:rPr>
-        <w:t>El propósito técnico del trabajo es demostrar que una solución de consola en Java puede resolver un problema real mediante estructuras personalizadas. A diferencia de usar colecciones ya implementadas por el lenguaje, en esta actividad se crea explícitamente la lógica de nodos, enlaces, recorridos, inserciones, eliminaciones y consultas, lo que permite comprender el funcionamiento interno de las estructuras de datos lineales (</w:t>
-      </w:r>
-      <w:proofErr w:type="spellStart"/>
-      <w:r>
-        <w:rPr>
-          <w:rFonts w:cs="Times New Roman"/>
-          <w:szCs w:val="24"/>
-          <w:lang w:val="es-CO"/>
-        </w:rPr>
-        <w:t>Cormen</w:t>
-      </w:r>
-      <w:proofErr w:type="spellEnd"/>
-      <w:r>
-        <w:rPr>
-          <w:rFonts w:cs="Times New Roman"/>
-          <w:szCs w:val="24"/>
-          <w:lang w:val="es-CO"/>
-        </w:rPr>
-        <w:t xml:space="preserve"> et al., 2022; Goodrich et al., 2014).</w:t>
+        <w:t>El propósito técnico del trabajo es demostrar que una solución de consola en Java puede resolver un problema real mediante estructuras personalizadas. A diferencia de usar colecciones ya implementadas por el lenguaje, en esta actividad se crea explícitamente la lógica de nodos, enlaces, recorridos, inserciones, eliminaciones y consultas, lo que permite comprender el funcionamiento interno de las estructuras de datos lineales (Cormen et al., 2022; Goodrich et al., 2014).</w:t>
       </w:r>
     </w:p>
     <w:p>
@@ -468,31 +440,13 @@
           <w:szCs w:val="24"/>
         </w:rPr>
       </w:pPr>
-      <w:proofErr w:type="spellStart"/>
       <w:r>
         <w:rPr>
           <w:rFonts w:ascii="Times New Roman" w:hAnsi="Times New Roman" w:cs="Times New Roman"/>
           <w:szCs w:val="24"/>
         </w:rPr>
-        <w:t>Objetivos</w:t>
+        <w:t>Objetivos Específicos</w:t>
       </w:r>
-      <w:proofErr w:type="spellEnd"/>
-      <w:r>
-        <w:rPr>
-          <w:rFonts w:ascii="Times New Roman" w:hAnsi="Times New Roman" w:cs="Times New Roman"/>
-          <w:szCs w:val="24"/>
-        </w:rPr>
-        <w:t xml:space="preserve"> </w:t>
-      </w:r>
-      <w:proofErr w:type="spellStart"/>
-      <w:r>
-        <w:rPr>
-          <w:rFonts w:ascii="Times New Roman" w:hAnsi="Times New Roman" w:cs="Times New Roman"/>
-          <w:szCs w:val="24"/>
-        </w:rPr>
-        <w:t>Específicos</w:t>
-      </w:r>
-      <w:proofErr w:type="spellEnd"/>
     </w:p>
     <w:p>
       <w:pPr>
@@ -510,63 +464,7 @@
           <w:szCs w:val="24"/>
           <w:lang w:val="es-CO"/>
         </w:rPr>
-        <w:t xml:space="preserve">Diseñar la clase Pedido con atributos, constructor, métodos de acceso, </w:t>
-      </w:r>
-      <w:proofErr w:type="spellStart"/>
-      <w:proofErr w:type="gramStart"/>
-      <w:r>
-        <w:rPr>
-          <w:rFonts w:cs="Times New Roman"/>
-          <w:szCs w:val="24"/>
-          <w:lang w:val="es-CO"/>
-        </w:rPr>
-        <w:t>toString</w:t>
-      </w:r>
-      <w:proofErr w:type="spellEnd"/>
-      <w:r>
-        <w:rPr>
-          <w:rFonts w:cs="Times New Roman"/>
-          <w:szCs w:val="24"/>
-          <w:lang w:val="es-CO"/>
-        </w:rPr>
-        <w:t>(</w:t>
-      </w:r>
-      <w:proofErr w:type="gramEnd"/>
-      <w:r>
-        <w:rPr>
-          <w:rFonts w:cs="Times New Roman"/>
-          <w:szCs w:val="24"/>
-          <w:lang w:val="es-CO"/>
-        </w:rPr>
-        <w:t xml:space="preserve">) y </w:t>
-      </w:r>
-      <w:proofErr w:type="spellStart"/>
-      <w:proofErr w:type="gramStart"/>
-      <w:r>
-        <w:rPr>
-          <w:rFonts w:cs="Times New Roman"/>
-          <w:szCs w:val="24"/>
-          <w:lang w:val="es-CO"/>
-        </w:rPr>
-        <w:t>equals</w:t>
-      </w:r>
-      <w:proofErr w:type="spellEnd"/>
-      <w:r>
-        <w:rPr>
-          <w:rFonts w:cs="Times New Roman"/>
-          <w:szCs w:val="24"/>
-          <w:lang w:val="es-CO"/>
-        </w:rPr>
-        <w:t>(</w:t>
-      </w:r>
-      <w:proofErr w:type="gramEnd"/>
-      <w:r>
-        <w:rPr>
-          <w:rFonts w:cs="Times New Roman"/>
-          <w:szCs w:val="24"/>
-          <w:lang w:val="es-CO"/>
-        </w:rPr>
-        <w:t>) basado en el número de pedido.</w:t>
+        <w:t>Diseñar la clase Pedido con atributos, constructor, métodos de acceso, toString() y equals() basado en el número de pedido.</w:t>
       </w:r>
     </w:p>
     <w:p>
@@ -899,117 +797,7 @@
           <w:szCs w:val="24"/>
           <w:lang w:val="es-CO"/>
         </w:rPr>
-        <w:t xml:space="preserve">También se reforzaron conceptos de programación orientada a objetos, como encapsulamiento, creación de clases, constructores, </w:t>
-      </w:r>
-      <w:proofErr w:type="spellStart"/>
-      <w:r>
-        <w:rPr>
-          <w:rFonts w:cs="Times New Roman"/>
-          <w:szCs w:val="24"/>
-          <w:lang w:val="es-CO"/>
-        </w:rPr>
-        <w:t>getters</w:t>
-      </w:r>
-      <w:proofErr w:type="spellEnd"/>
-      <w:r>
-        <w:rPr>
-          <w:rFonts w:cs="Times New Roman"/>
-          <w:szCs w:val="24"/>
-          <w:lang w:val="es-CO"/>
-        </w:rPr>
-        <w:t xml:space="preserve">, </w:t>
-      </w:r>
-      <w:proofErr w:type="spellStart"/>
-      <w:r>
-        <w:rPr>
-          <w:rFonts w:cs="Times New Roman"/>
-          <w:szCs w:val="24"/>
-          <w:lang w:val="es-CO"/>
-        </w:rPr>
-        <w:t>setters</w:t>
-      </w:r>
-      <w:proofErr w:type="spellEnd"/>
-      <w:r>
-        <w:rPr>
-          <w:rFonts w:cs="Times New Roman"/>
-          <w:szCs w:val="24"/>
-          <w:lang w:val="es-CO"/>
-        </w:rPr>
-        <w:t xml:space="preserve">, </w:t>
-      </w:r>
-      <w:proofErr w:type="spellStart"/>
-      <w:r>
-        <w:rPr>
-          <w:rFonts w:cs="Times New Roman"/>
-          <w:szCs w:val="24"/>
-          <w:lang w:val="es-CO"/>
-        </w:rPr>
-        <w:t>sobrescritura</w:t>
-      </w:r>
-      <w:proofErr w:type="spellEnd"/>
-      <w:r>
-        <w:rPr>
-          <w:rFonts w:cs="Times New Roman"/>
-          <w:szCs w:val="24"/>
-          <w:lang w:val="es-CO"/>
-        </w:rPr>
-        <w:t xml:space="preserve"> de </w:t>
-      </w:r>
-      <w:proofErr w:type="spellStart"/>
-      <w:proofErr w:type="gramStart"/>
-      <w:r>
-        <w:rPr>
-          <w:rFonts w:cs="Times New Roman"/>
-          <w:szCs w:val="24"/>
-          <w:lang w:val="es-CO"/>
-        </w:rPr>
-        <w:t>toString</w:t>
-      </w:r>
-      <w:proofErr w:type="spellEnd"/>
-      <w:r>
-        <w:rPr>
-          <w:rFonts w:cs="Times New Roman"/>
-          <w:szCs w:val="24"/>
-          <w:lang w:val="es-CO"/>
-        </w:rPr>
-        <w:t>(</w:t>
-      </w:r>
-      <w:proofErr w:type="gramEnd"/>
-      <w:r>
-        <w:rPr>
-          <w:rFonts w:cs="Times New Roman"/>
-          <w:szCs w:val="24"/>
-          <w:lang w:val="es-CO"/>
-        </w:rPr>
-        <w:t xml:space="preserve">) y comparación mediante </w:t>
-      </w:r>
-      <w:proofErr w:type="spellStart"/>
-      <w:proofErr w:type="gramStart"/>
-      <w:r>
-        <w:rPr>
-          <w:rFonts w:cs="Times New Roman"/>
-          <w:szCs w:val="24"/>
-          <w:lang w:val="es-CO"/>
-        </w:rPr>
-        <w:t>equals</w:t>
-      </w:r>
-      <w:proofErr w:type="spellEnd"/>
-      <w:r>
-        <w:rPr>
-          <w:rFonts w:cs="Times New Roman"/>
-          <w:szCs w:val="24"/>
-          <w:lang w:val="es-CO"/>
-        </w:rPr>
-        <w:t>(</w:t>
-      </w:r>
-      <w:proofErr w:type="gramEnd"/>
-      <w:r>
-        <w:rPr>
-          <w:rFonts w:cs="Times New Roman"/>
-          <w:szCs w:val="24"/>
-          <w:lang w:val="es-CO"/>
-        </w:rPr>
-        <w:t>). En la clase Pedido, el número de pedido se usa como identificador principal para evitar duplicados y realizar búsquedas coherentes.</w:t>
+        <w:t>También se reforzaron conceptos de programación orientada a objetos, como encapsulamiento, creación de clases, constructores, getters, setters, sobrescritura de toString() y comparación mediante equals(). En la clase Pedido, el número de pedido se usa como identificador principal para evitar duplicados y realizar búsquedas coherentes.</w:t>
       </w:r>
     </w:p>
     <w:p>
@@ -1136,7 +924,6 @@
                 <w:szCs w:val="24"/>
               </w:rPr>
             </w:pPr>
-            <w:proofErr w:type="spellStart"/>
             <w:r>
               <w:rPr>
                 <w:rFonts w:cs="Times New Roman"/>
@@ -1145,7 +932,6 @@
               </w:rPr>
               <w:t>Operación</w:t>
             </w:r>
-            <w:proofErr w:type="spellEnd"/>
           </w:p>
         </w:tc>
         <w:tc>
@@ -1285,31 +1071,13 @@
                 <w:szCs w:val="24"/>
               </w:rPr>
             </w:pPr>
-            <w:proofErr w:type="spellStart"/>
             <w:r>
               <w:rPr>
                 <w:rFonts w:cs="Times New Roman"/>
                 <w:szCs w:val="24"/>
               </w:rPr>
-              <w:t>Procesar</w:t>
+              <w:t>Procesar pedido</w:t>
             </w:r>
-            <w:proofErr w:type="spellEnd"/>
-            <w:r>
-              <w:rPr>
-                <w:rFonts w:cs="Times New Roman"/>
-                <w:szCs w:val="24"/>
-              </w:rPr>
-              <w:t xml:space="preserve"> </w:t>
-            </w:r>
-            <w:proofErr w:type="spellStart"/>
-            <w:r>
-              <w:rPr>
-                <w:rFonts w:cs="Times New Roman"/>
-                <w:szCs w:val="24"/>
-              </w:rPr>
-              <w:t>pedido</w:t>
-            </w:r>
-            <w:proofErr w:type="spellEnd"/>
           </w:p>
         </w:tc>
         <w:tc>
@@ -1376,31 +1144,13 @@
                 <w:szCs w:val="24"/>
               </w:rPr>
             </w:pPr>
-            <w:proofErr w:type="spellStart"/>
             <w:r>
               <w:rPr>
                 <w:rFonts w:cs="Times New Roman"/>
                 <w:szCs w:val="24"/>
               </w:rPr>
-              <w:t>Buscar</w:t>
+              <w:t>Buscar pedido</w:t>
             </w:r>
-            <w:proofErr w:type="spellEnd"/>
-            <w:r>
-              <w:rPr>
-                <w:rFonts w:cs="Times New Roman"/>
-                <w:szCs w:val="24"/>
-              </w:rPr>
-              <w:t xml:space="preserve"> </w:t>
-            </w:r>
-            <w:proofErr w:type="spellStart"/>
-            <w:r>
-              <w:rPr>
-                <w:rFonts w:cs="Times New Roman"/>
-                <w:szCs w:val="24"/>
-              </w:rPr>
-              <w:t>pedido</w:t>
-            </w:r>
-            <w:proofErr w:type="spellEnd"/>
           </w:p>
         </w:tc>
         <w:tc>
@@ -1467,31 +1217,13 @@
                 <w:szCs w:val="24"/>
               </w:rPr>
             </w:pPr>
-            <w:proofErr w:type="spellStart"/>
             <w:r>
               <w:rPr>
                 <w:rFonts w:cs="Times New Roman"/>
                 <w:szCs w:val="24"/>
               </w:rPr>
-              <w:t>Cancelar</w:t>
+              <w:t>Cancelar pendiente</w:t>
             </w:r>
-            <w:proofErr w:type="spellEnd"/>
-            <w:r>
-              <w:rPr>
-                <w:rFonts w:cs="Times New Roman"/>
-                <w:szCs w:val="24"/>
-              </w:rPr>
-              <w:t xml:space="preserve"> </w:t>
-            </w:r>
-            <w:proofErr w:type="spellStart"/>
-            <w:r>
-              <w:rPr>
-                <w:rFonts w:cs="Times New Roman"/>
-                <w:szCs w:val="24"/>
-              </w:rPr>
-              <w:t>pendiente</w:t>
-            </w:r>
-            <w:proofErr w:type="spellEnd"/>
           </w:p>
         </w:tc>
         <w:tc>
@@ -1558,31 +1290,13 @@
                 <w:szCs w:val="24"/>
               </w:rPr>
             </w:pPr>
-            <w:proofErr w:type="spellStart"/>
             <w:r>
               <w:rPr>
                 <w:rFonts w:cs="Times New Roman"/>
                 <w:szCs w:val="24"/>
               </w:rPr>
-              <w:t>Deshacer</w:t>
+              <w:t>Deshacer procesamiento</w:t>
             </w:r>
-            <w:proofErr w:type="spellEnd"/>
-            <w:r>
-              <w:rPr>
-                <w:rFonts w:cs="Times New Roman"/>
-                <w:szCs w:val="24"/>
-              </w:rPr>
-              <w:t xml:space="preserve"> </w:t>
-            </w:r>
-            <w:proofErr w:type="spellStart"/>
-            <w:r>
-              <w:rPr>
-                <w:rFonts w:cs="Times New Roman"/>
-                <w:szCs w:val="24"/>
-              </w:rPr>
-              <w:t>procesamiento</w:t>
-            </w:r>
-            <w:proofErr w:type="spellEnd"/>
           </w:p>
         </w:tc>
         <w:tc>
@@ -1667,71 +1381,7 @@
           <w:szCs w:val="24"/>
           <w:lang w:val="es-CO"/>
         </w:rPr>
-        <w:t xml:space="preserve">La entidad Pedido representa el elemento central del caso Restaurante. Se diseñó con cinco atributos: </w:t>
-      </w:r>
-      <w:proofErr w:type="spellStart"/>
-      <w:r>
-        <w:rPr>
-          <w:rFonts w:cs="Times New Roman"/>
-          <w:szCs w:val="24"/>
-          <w:lang w:val="es-CO"/>
-        </w:rPr>
-        <w:t>numeroPedido</w:t>
-      </w:r>
-      <w:proofErr w:type="spellEnd"/>
-      <w:r>
-        <w:rPr>
-          <w:rFonts w:cs="Times New Roman"/>
-          <w:szCs w:val="24"/>
-          <w:lang w:val="es-CO"/>
-        </w:rPr>
-        <w:t xml:space="preserve">, cliente, </w:t>
-      </w:r>
-      <w:proofErr w:type="spellStart"/>
-      <w:r>
-        <w:rPr>
-          <w:rFonts w:cs="Times New Roman"/>
-          <w:szCs w:val="24"/>
-          <w:lang w:val="es-CO"/>
-        </w:rPr>
-        <w:t>descripcion</w:t>
-      </w:r>
-      <w:proofErr w:type="spellEnd"/>
-      <w:r>
-        <w:rPr>
-          <w:rFonts w:cs="Times New Roman"/>
-          <w:szCs w:val="24"/>
-          <w:lang w:val="es-CO"/>
-        </w:rPr>
-        <w:t xml:space="preserve">, total y estado. El método </w:t>
-      </w:r>
-      <w:proofErr w:type="spellStart"/>
-      <w:proofErr w:type="gramStart"/>
-      <w:r>
-        <w:rPr>
-          <w:rFonts w:cs="Times New Roman"/>
-          <w:szCs w:val="24"/>
-          <w:lang w:val="es-CO"/>
-        </w:rPr>
-        <w:t>equals</w:t>
-      </w:r>
-      <w:proofErr w:type="spellEnd"/>
-      <w:r>
-        <w:rPr>
-          <w:rFonts w:cs="Times New Roman"/>
-          <w:szCs w:val="24"/>
-          <w:lang w:val="es-CO"/>
-        </w:rPr>
-        <w:t>(</w:t>
-      </w:r>
-      <w:proofErr w:type="gramEnd"/>
-      <w:r>
-        <w:rPr>
-          <w:rFonts w:cs="Times New Roman"/>
-          <w:szCs w:val="24"/>
-          <w:lang w:val="es-CO"/>
-        </w:rPr>
-        <w:t>) compara por número de pedido, porque ese dato identifica de forma única cada solicitud dentro del sistema.</w:t>
+        <w:t>La entidad Pedido representa el elemento central del caso Restaurante. Se diseñó con cinco atributos: numeroPedido, cliente, descripcion, total y estado. El método equals() compara por número de pedido, porque ese dato identifica de forma única cada solicitud dentro del sistema.</w:t>
       </w:r>
     </w:p>
     <w:tbl>
@@ -1762,44 +1412,14 @@
                 <w:szCs w:val="24"/>
               </w:rPr>
             </w:pPr>
-            <w:proofErr w:type="gramStart"/>
             <w:r>
               <w:rPr>
                 <w:rFonts w:ascii="Times New Roman" w:hAnsi="Times New Roman" w:cs="Times New Roman"/>
                 <w:sz w:val="24"/>
                 <w:szCs w:val="24"/>
               </w:rPr>
-              <w:t>public</w:t>
+              <w:t>public class Pedido {</w:t>
             </w:r>
-            <w:proofErr w:type="gramEnd"/>
-            <w:r>
-              <w:rPr>
-                <w:rFonts w:ascii="Times New Roman" w:hAnsi="Times New Roman" w:cs="Times New Roman"/>
-                <w:sz w:val="24"/>
-                <w:szCs w:val="24"/>
-              </w:rPr>
-              <w:t xml:space="preserve"> class </w:t>
-            </w:r>
-            <w:proofErr w:type="spellStart"/>
-            <w:proofErr w:type="gramStart"/>
-            <w:r>
-              <w:rPr>
-                <w:rFonts w:ascii="Times New Roman" w:hAnsi="Times New Roman" w:cs="Times New Roman"/>
-                <w:sz w:val="24"/>
-                <w:szCs w:val="24"/>
-              </w:rPr>
-              <w:t>Pedido</w:t>
-            </w:r>
-            <w:proofErr w:type="spellEnd"/>
-            <w:r>
-              <w:rPr>
-                <w:rFonts w:ascii="Times New Roman" w:hAnsi="Times New Roman" w:cs="Times New Roman"/>
-                <w:sz w:val="24"/>
-                <w:szCs w:val="24"/>
-              </w:rPr>
-              <w:t xml:space="preserve"> {</w:t>
-            </w:r>
-            <w:proofErr w:type="gramEnd"/>
           </w:p>
           <w:p>
             <w:pPr>
@@ -1923,55 +1543,7 @@
                 <w:sz w:val="24"/>
                 <w:szCs w:val="24"/>
               </w:rPr>
-              <w:t xml:space="preserve">    </w:t>
-            </w:r>
-            <w:proofErr w:type="gramStart"/>
-            <w:r>
-              <w:rPr>
-                <w:rFonts w:ascii="Times New Roman" w:hAnsi="Times New Roman" w:cs="Times New Roman"/>
-                <w:sz w:val="24"/>
-                <w:szCs w:val="24"/>
-              </w:rPr>
-              <w:t>@Override</w:t>
-            </w:r>
-            <w:proofErr w:type="gramEnd"/>
-          </w:p>
-          <w:p>
-            <w:pPr>
-              <w:pStyle w:val="CodeBlock"/>
-              <w:jc w:val="both"/>
-              <w:rPr>
-                <w:rFonts w:ascii="Times New Roman" w:hAnsi="Times New Roman" w:cs="Times New Roman"/>
-                <w:sz w:val="24"/>
-                <w:szCs w:val="24"/>
-              </w:rPr>
-            </w:pPr>
-            <w:r>
-              <w:rPr>
-                <w:rFonts w:ascii="Times New Roman" w:hAnsi="Times New Roman" w:cs="Times New Roman"/>
-                <w:sz w:val="24"/>
-                <w:szCs w:val="24"/>
-              </w:rPr>
-              <w:lastRenderedPageBreak/>
-              <w:t xml:space="preserve">    public boolean </w:t>
-            </w:r>
-            <w:proofErr w:type="gramStart"/>
-            <w:r>
-              <w:rPr>
-                <w:rFonts w:ascii="Times New Roman" w:hAnsi="Times New Roman" w:cs="Times New Roman"/>
-                <w:sz w:val="24"/>
-                <w:szCs w:val="24"/>
-              </w:rPr>
-              <w:t>equals(</w:t>
-            </w:r>
-            <w:proofErr w:type="gramEnd"/>
-            <w:r>
-              <w:rPr>
-                <w:rFonts w:ascii="Times New Roman" w:hAnsi="Times New Roman" w:cs="Times New Roman"/>
-                <w:sz w:val="24"/>
-                <w:szCs w:val="24"/>
-              </w:rPr>
-              <w:t>Object obj) {</w:t>
+              <w:t xml:space="preserve">    @Override</w:t>
             </w:r>
           </w:p>
           <w:p>
@@ -1990,25 +1562,8 @@
                 <w:sz w:val="24"/>
                 <w:szCs w:val="24"/>
               </w:rPr>
-              <w:t xml:space="preserve">        if (this == obj) </w:t>
-            </w:r>
-            <w:proofErr w:type="gramStart"/>
-            <w:r>
-              <w:rPr>
-                <w:rFonts w:ascii="Times New Roman" w:hAnsi="Times New Roman" w:cs="Times New Roman"/>
-                <w:sz w:val="24"/>
-                <w:szCs w:val="24"/>
-              </w:rPr>
-              <w:t>return</w:t>
-            </w:r>
-            <w:proofErr w:type="gramEnd"/>
-            <w:r>
-              <w:rPr>
-                <w:rFonts w:ascii="Times New Roman" w:hAnsi="Times New Roman" w:cs="Times New Roman"/>
-                <w:sz w:val="24"/>
-                <w:szCs w:val="24"/>
-              </w:rPr>
-              <w:t xml:space="preserve"> true;</w:t>
+              <w:lastRenderedPageBreak/>
+              <w:t xml:space="preserve">    public boolean equals(Object obj) {</w:t>
             </w:r>
           </w:p>
           <w:p>
@@ -2027,43 +1582,7 @@
                 <w:sz w:val="24"/>
                 <w:szCs w:val="24"/>
               </w:rPr>
-              <w:t xml:space="preserve">        if </w:t>
-            </w:r>
-            <w:proofErr w:type="gramStart"/>
-            <w:r>
-              <w:rPr>
-                <w:rFonts w:ascii="Times New Roman" w:hAnsi="Times New Roman" w:cs="Times New Roman"/>
-                <w:sz w:val="24"/>
-                <w:szCs w:val="24"/>
-              </w:rPr>
-              <w:t>(!(</w:t>
-            </w:r>
-            <w:proofErr w:type="gramEnd"/>
-            <w:r>
-              <w:rPr>
-                <w:rFonts w:ascii="Times New Roman" w:hAnsi="Times New Roman" w:cs="Times New Roman"/>
-                <w:sz w:val="24"/>
-                <w:szCs w:val="24"/>
-              </w:rPr>
-              <w:t xml:space="preserve">obj </w:t>
-            </w:r>
-            <w:proofErr w:type="gramStart"/>
-            <w:r>
-              <w:rPr>
-                <w:rFonts w:ascii="Times New Roman" w:hAnsi="Times New Roman" w:cs="Times New Roman"/>
-                <w:sz w:val="24"/>
-                <w:szCs w:val="24"/>
-              </w:rPr>
-              <w:t>instanceof</w:t>
-            </w:r>
-            <w:proofErr w:type="gramEnd"/>
-            <w:r>
-              <w:rPr>
-                <w:rFonts w:ascii="Times New Roman" w:hAnsi="Times New Roman" w:cs="Times New Roman"/>
-                <w:sz w:val="24"/>
-                <w:szCs w:val="24"/>
-              </w:rPr>
-              <w:t xml:space="preserve"> Pedido)) return false;</w:t>
+              <w:t xml:space="preserve">        if (this == obj) return true;</w:t>
             </w:r>
           </w:p>
           <w:p>
@@ -2074,7 +1593,6 @@
                 <w:rFonts w:ascii="Times New Roman" w:hAnsi="Times New Roman" w:cs="Times New Roman"/>
                 <w:sz w:val="24"/>
                 <w:szCs w:val="24"/>
-                <w:lang w:val="es-CO"/>
               </w:rPr>
             </w:pPr>
             <w:r>
@@ -2083,36 +1601,7 @@
                 <w:sz w:val="24"/>
                 <w:szCs w:val="24"/>
               </w:rPr>
-              <w:t xml:space="preserve">        </w:t>
-            </w:r>
-            <w:r>
-              <w:rPr>
-                <w:rFonts w:ascii="Times New Roman" w:hAnsi="Times New Roman" w:cs="Times New Roman"/>
-                <w:sz w:val="24"/>
-                <w:szCs w:val="24"/>
-                <w:lang w:val="es-CO"/>
-              </w:rPr>
-              <w:t xml:space="preserve">Pedido otro = (Pedido) </w:t>
-            </w:r>
-            <w:proofErr w:type="spellStart"/>
-            <w:r>
-              <w:rPr>
-                <w:rFonts w:ascii="Times New Roman" w:hAnsi="Times New Roman" w:cs="Times New Roman"/>
-                <w:sz w:val="24"/>
-                <w:szCs w:val="24"/>
-                <w:lang w:val="es-CO"/>
-              </w:rPr>
-              <w:t>obj</w:t>
-            </w:r>
-            <w:proofErr w:type="spellEnd"/>
-            <w:r>
-              <w:rPr>
-                <w:rFonts w:ascii="Times New Roman" w:hAnsi="Times New Roman" w:cs="Times New Roman"/>
-                <w:sz w:val="24"/>
-                <w:szCs w:val="24"/>
-                <w:lang w:val="es-CO"/>
-              </w:rPr>
-              <w:t>;</w:t>
+              <w:t xml:space="preserve">        if (!(obj instanceof Pedido)) return false;</w:t>
             </w:r>
           </w:p>
           <w:p>
@@ -2131,11 +1620,9 @@
                 <w:rFonts w:ascii="Times New Roman" w:hAnsi="Times New Roman" w:cs="Times New Roman"/>
                 <w:sz w:val="24"/>
                 <w:szCs w:val="24"/>
-                <w:lang w:val="es-CO"/>
               </w:rPr>
               <w:t xml:space="preserve">        </w:t>
             </w:r>
-            <w:proofErr w:type="spellStart"/>
             <w:r>
               <w:rPr>
                 <w:rFonts w:ascii="Times New Roman" w:hAnsi="Times New Roman" w:cs="Times New Roman"/>
@@ -2143,59 +1630,7 @@
                 <w:szCs w:val="24"/>
                 <w:lang w:val="es-CO"/>
               </w:rPr>
-              <w:t>return</w:t>
-            </w:r>
-            <w:proofErr w:type="spellEnd"/>
-            <w:r>
-              <w:rPr>
-                <w:rFonts w:ascii="Times New Roman" w:hAnsi="Times New Roman" w:cs="Times New Roman"/>
-                <w:sz w:val="24"/>
-                <w:szCs w:val="24"/>
-                <w:lang w:val="es-CO"/>
-              </w:rPr>
-              <w:t xml:space="preserve"> </w:t>
-            </w:r>
-            <w:proofErr w:type="spellStart"/>
-            <w:r>
-              <w:rPr>
-                <w:rFonts w:ascii="Times New Roman" w:hAnsi="Times New Roman" w:cs="Times New Roman"/>
-                <w:sz w:val="24"/>
-                <w:szCs w:val="24"/>
-                <w:lang w:val="es-CO"/>
-              </w:rPr>
-              <w:t>numeroPedido.equalsIgnoreCase</w:t>
-            </w:r>
-            <w:proofErr w:type="spellEnd"/>
-            <w:r>
-              <w:rPr>
-                <w:rFonts w:ascii="Times New Roman" w:hAnsi="Times New Roman" w:cs="Times New Roman"/>
-                <w:sz w:val="24"/>
-                <w:szCs w:val="24"/>
-                <w:lang w:val="es-CO"/>
-              </w:rPr>
-              <w:t>(</w:t>
-            </w:r>
-            <w:proofErr w:type="spellStart"/>
-            <w:proofErr w:type="gramStart"/>
-            <w:r>
-              <w:rPr>
-                <w:rFonts w:ascii="Times New Roman" w:hAnsi="Times New Roman" w:cs="Times New Roman"/>
-                <w:sz w:val="24"/>
-                <w:szCs w:val="24"/>
-                <w:lang w:val="es-CO"/>
-              </w:rPr>
-              <w:t>otro.numeroPedido</w:t>
-            </w:r>
-            <w:proofErr w:type="spellEnd"/>
-            <w:proofErr w:type="gramEnd"/>
-            <w:r>
-              <w:rPr>
-                <w:rFonts w:ascii="Times New Roman" w:hAnsi="Times New Roman" w:cs="Times New Roman"/>
-                <w:sz w:val="24"/>
-                <w:szCs w:val="24"/>
-                <w:lang w:val="es-CO"/>
-              </w:rPr>
-              <w:t>);</w:t>
+              <w:t>Pedido otro = (Pedido) obj;</w:t>
             </w:r>
           </w:p>
           <w:p>
@@ -2206,6 +1641,28 @@
                 <w:rFonts w:ascii="Times New Roman" w:hAnsi="Times New Roman" w:cs="Times New Roman"/>
                 <w:sz w:val="24"/>
                 <w:szCs w:val="24"/>
+                <w:lang w:val="es-CO"/>
+              </w:rPr>
+            </w:pPr>
+            <w:r>
+              <w:rPr>
+                <w:rFonts w:ascii="Times New Roman" w:hAnsi="Times New Roman" w:cs="Times New Roman"/>
+                <w:sz w:val="24"/>
+                <w:szCs w:val="24"/>
+                <w:lang w:val="es-CO"/>
+              </w:rPr>
+              <w:t xml:space="preserve">        return numeroPedido.equalsIgnoreCase(otro.numeroPedido);</w:t>
+            </w:r>
+          </w:p>
+          <w:p>
+            <w:pPr>
+              <w:pStyle w:val="CodeBlock"/>
+              <w:jc w:val="both"/>
+              <w:rPr>
+                <w:rFonts w:ascii="Times New Roman" w:hAnsi="Times New Roman" w:cs="Times New Roman"/>
+                <w:sz w:val="24"/>
+                <w:szCs w:val="24"/>
+                <w:lang w:val="es-CO"/>
               </w:rPr>
             </w:pPr>
             <w:r>
@@ -2222,6 +1679,7 @@
                 <w:rFonts w:ascii="Times New Roman" w:hAnsi="Times New Roman" w:cs="Times New Roman"/>
                 <w:sz w:val="24"/>
                 <w:szCs w:val="24"/>
+                <w:lang w:val="es-CO"/>
               </w:rPr>
               <w:t>}</w:t>
             </w:r>
@@ -2570,7 +2028,6 @@
                 <w:szCs w:val="24"/>
               </w:rPr>
             </w:pPr>
-            <w:proofErr w:type="spellStart"/>
             <w:r>
               <w:rPr>
                 <w:rFonts w:cs="Times New Roman"/>
@@ -2578,7 +2035,6 @@
               </w:rPr>
               <w:t>Pedido</w:t>
             </w:r>
-            <w:proofErr w:type="spellEnd"/>
           </w:p>
         </w:tc>
         <w:tc>
@@ -2623,7 +2079,6 @@
                 <w:szCs w:val="24"/>
               </w:rPr>
             </w:pPr>
-            <w:proofErr w:type="spellStart"/>
             <w:r>
               <w:rPr>
                 <w:rFonts w:cs="Times New Roman"/>
@@ -2631,7 +2086,6 @@
               </w:rPr>
               <w:t>SistemaRestaurante</w:t>
             </w:r>
-            <w:proofErr w:type="spellEnd"/>
           </w:p>
         </w:tc>
         <w:tc>
@@ -2731,25 +2185,7 @@
           <w:lang w:val="es-CO"/>
         </w:rPr>
         <w:lastRenderedPageBreak/>
-        <w:t xml:space="preserve">La Pila personalizada se utiliza como historial de procesados. Su principio LIFO permite que el último pedido procesado sea el primero disponible para deshacer. Por eso, si el usuario selecciona deshacer, se </w:t>
-      </w:r>
-      <w:proofErr w:type="spellStart"/>
-      <w:r>
-        <w:rPr>
-          <w:rFonts w:cs="Times New Roman"/>
-          <w:szCs w:val="24"/>
-          <w:lang w:val="es-CO"/>
-        </w:rPr>
-        <w:t>desapila</w:t>
-      </w:r>
-      <w:proofErr w:type="spellEnd"/>
-      <w:r>
-        <w:rPr>
-          <w:rFonts w:cs="Times New Roman"/>
-          <w:szCs w:val="24"/>
-          <w:lang w:val="es-CO"/>
-        </w:rPr>
-        <w:t xml:space="preserve"> el último elemento y se devuelve a la cola de pendientes.</w:t>
+        <w:t>La Pila personalizada se utiliza como historial de procesados. Su principio LIFO permite que el último pedido procesado sea el primero disponible para deshacer. Por eso, si el usuario selecciona deshacer, se desapila el último elemento y se devuelve a la cola de pendientes.</w:t>
       </w:r>
     </w:p>
     <w:p>
@@ -3257,25 +2693,7 @@
                 <w:szCs w:val="24"/>
                 <w:lang w:val="es-CO"/>
               </w:rPr>
-              <w:t xml:space="preserve">La operación deshacer </w:t>
-            </w:r>
-            <w:proofErr w:type="spellStart"/>
-            <w:r>
-              <w:rPr>
-                <w:rFonts w:cs="Times New Roman"/>
-                <w:szCs w:val="24"/>
-                <w:lang w:val="es-CO"/>
-              </w:rPr>
-              <w:t>desapila</w:t>
-            </w:r>
-            <w:proofErr w:type="spellEnd"/>
-            <w:r>
-              <w:rPr>
-                <w:rFonts w:cs="Times New Roman"/>
-                <w:szCs w:val="24"/>
-                <w:lang w:val="es-CO"/>
-              </w:rPr>
-              <w:t xml:space="preserve"> el último procesado y lo encola nuevamente.</w:t>
+              <w:t>La operación deshacer desapila el último procesado y lo encola nuevamente.</w:t>
             </w:r>
           </w:p>
         </w:tc>
@@ -3289,53 +2707,12 @@
           <w:szCs w:val="24"/>
         </w:rPr>
       </w:pPr>
-      <w:proofErr w:type="spellStart"/>
       <w:r>
         <w:rPr>
           <w:rFonts w:cs="Times New Roman"/>
           <w:szCs w:val="24"/>
         </w:rPr>
-        <w:t>Representación</w:t>
-      </w:r>
-      <w:proofErr w:type="spellEnd"/>
-      <w:r>
-        <w:rPr>
-          <w:rFonts w:cs="Times New Roman"/>
-          <w:szCs w:val="24"/>
-        </w:rPr>
-        <w:t xml:space="preserve"> </w:t>
-      </w:r>
-      <w:proofErr w:type="spellStart"/>
-      <w:r>
-        <w:rPr>
-          <w:rFonts w:cs="Times New Roman"/>
-          <w:szCs w:val="24"/>
-        </w:rPr>
-        <w:t>simplificada</w:t>
-      </w:r>
-      <w:proofErr w:type="spellEnd"/>
-      <w:r>
-        <w:rPr>
-          <w:rFonts w:cs="Times New Roman"/>
-          <w:szCs w:val="24"/>
-        </w:rPr>
-        <w:t xml:space="preserve"> del </w:t>
-      </w:r>
-      <w:proofErr w:type="spellStart"/>
-      <w:r>
-        <w:rPr>
-          <w:rFonts w:cs="Times New Roman"/>
-          <w:szCs w:val="24"/>
-        </w:rPr>
-        <w:t>flujo</w:t>
-      </w:r>
-      <w:proofErr w:type="spellEnd"/>
-      <w:r>
-        <w:rPr>
-          <w:rFonts w:cs="Times New Roman"/>
-          <w:szCs w:val="24"/>
-        </w:rPr>
-        <w:t>:</w:t>
+        <w:t>Representación simplificada del flujo:</w:t>
       </w:r>
     </w:p>
     <w:tbl>
@@ -3416,27 +2793,7 @@
                 <w:szCs w:val="24"/>
                 <w:lang w:val="es-CO"/>
               </w:rPr>
-              <w:t xml:space="preserve">Lista general de </w:t>
-            </w:r>
-            <w:proofErr w:type="gramStart"/>
-            <w:r>
-              <w:rPr>
-                <w:rFonts w:ascii="Times New Roman" w:hAnsi="Times New Roman" w:cs="Times New Roman"/>
-                <w:sz w:val="24"/>
-                <w:szCs w:val="24"/>
-                <w:lang w:val="es-CO"/>
-              </w:rPr>
-              <w:t>pedidos  ←</w:t>
-            </w:r>
-            <w:proofErr w:type="gramEnd"/>
-            <w:r>
-              <w:rPr>
-                <w:rFonts w:ascii="Times New Roman" w:hAnsi="Times New Roman" w:cs="Times New Roman"/>
-                <w:sz w:val="24"/>
-                <w:szCs w:val="24"/>
-                <w:lang w:val="es-CO"/>
-              </w:rPr>
-              <w:t xml:space="preserve"> conserva todos los registros</w:t>
+              <w:t>Lista general de pedidos  ← conserva todos los registros</w:t>
             </w:r>
           </w:p>
           <w:p>
@@ -3520,27 +2877,7 @@
                 <w:szCs w:val="24"/>
                 <w:lang w:val="es-CO"/>
               </w:rPr>
-              <w:t xml:space="preserve">Pila de historial         ← </w:t>
-            </w:r>
-            <w:proofErr w:type="gramStart"/>
-            <w:r>
-              <w:rPr>
-                <w:rFonts w:ascii="Times New Roman" w:hAnsi="Times New Roman" w:cs="Times New Roman"/>
-                <w:sz w:val="24"/>
-                <w:szCs w:val="24"/>
-                <w:lang w:val="es-CO"/>
-              </w:rPr>
-              <w:t>guarda procesados</w:t>
-            </w:r>
-            <w:proofErr w:type="gramEnd"/>
-            <w:r>
-              <w:rPr>
-                <w:rFonts w:ascii="Times New Roman" w:hAnsi="Times New Roman" w:cs="Times New Roman"/>
-                <w:sz w:val="24"/>
-                <w:szCs w:val="24"/>
-                <w:lang w:val="es-CO"/>
-              </w:rPr>
-              <w:t xml:space="preserve"> y permite deshacer, LIFO</w:t>
+              <w:t>Pila de historial         ← guarda procesados y permite deshacer, LIFO</w:t>
             </w:r>
           </w:p>
         </w:tc>
@@ -3620,67 +2957,7 @@
                 <w:lang w:val="es-CO"/>
               </w:rPr>
               <w:lastRenderedPageBreak/>
-              <w:t xml:space="preserve">Pedido </w:t>
-            </w:r>
-            <w:proofErr w:type="spellStart"/>
-            <w:r>
-              <w:rPr>
-                <w:rFonts w:ascii="Times New Roman" w:hAnsi="Times New Roman" w:cs="Times New Roman"/>
-                <w:sz w:val="24"/>
-                <w:szCs w:val="24"/>
-                <w:lang w:val="es-CO"/>
-              </w:rPr>
-              <w:t>pedido</w:t>
-            </w:r>
-            <w:proofErr w:type="spellEnd"/>
-            <w:r>
-              <w:rPr>
-                <w:rFonts w:ascii="Times New Roman" w:hAnsi="Times New Roman" w:cs="Times New Roman"/>
-                <w:sz w:val="24"/>
-                <w:szCs w:val="24"/>
-                <w:lang w:val="es-CO"/>
-              </w:rPr>
-              <w:t xml:space="preserve"> = new </w:t>
-            </w:r>
-            <w:proofErr w:type="gramStart"/>
-            <w:r>
-              <w:rPr>
-                <w:rFonts w:ascii="Times New Roman" w:hAnsi="Times New Roman" w:cs="Times New Roman"/>
-                <w:sz w:val="24"/>
-                <w:szCs w:val="24"/>
-                <w:lang w:val="es-CO"/>
-              </w:rPr>
-              <w:t>Pedido(</w:t>
-            </w:r>
-            <w:proofErr w:type="gramEnd"/>
-            <w:r>
-              <w:rPr>
-                <w:rFonts w:ascii="Times New Roman" w:hAnsi="Times New Roman" w:cs="Times New Roman"/>
-                <w:sz w:val="24"/>
-                <w:szCs w:val="24"/>
-                <w:lang w:val="es-CO"/>
-              </w:rPr>
-              <w:t xml:space="preserve">numero, cliente, </w:t>
-            </w:r>
-            <w:proofErr w:type="spellStart"/>
-            <w:r>
-              <w:rPr>
-                <w:rFonts w:ascii="Times New Roman" w:hAnsi="Times New Roman" w:cs="Times New Roman"/>
-                <w:sz w:val="24"/>
-                <w:szCs w:val="24"/>
-                <w:lang w:val="es-CO"/>
-              </w:rPr>
-              <w:t>descripcion</w:t>
-            </w:r>
-            <w:proofErr w:type="spellEnd"/>
-            <w:r>
-              <w:rPr>
-                <w:rFonts w:ascii="Times New Roman" w:hAnsi="Times New Roman" w:cs="Times New Roman"/>
-                <w:sz w:val="24"/>
-                <w:szCs w:val="24"/>
-                <w:lang w:val="es-CO"/>
-              </w:rPr>
-              <w:t>, total, "PENDIENTE");</w:t>
+              <w:t>Pedido pedido = new Pedido(numero, cliente, descripcion, total, "PENDIENTE");</w:t>
             </w:r>
           </w:p>
           <w:p>
@@ -3694,7 +2971,6 @@
                 <w:lang w:val="es-CO"/>
               </w:rPr>
             </w:pPr>
-            <w:proofErr w:type="spellStart"/>
             <w:r>
               <w:rPr>
                 <w:rFonts w:ascii="Times New Roman" w:hAnsi="Times New Roman" w:cs="Times New Roman"/>
@@ -3702,17 +2978,7 @@
                 <w:szCs w:val="24"/>
                 <w:lang w:val="es-CO"/>
               </w:rPr>
-              <w:t>listaGeneral.agregar</w:t>
-            </w:r>
-            <w:proofErr w:type="spellEnd"/>
-            <w:r>
-              <w:rPr>
-                <w:rFonts w:ascii="Times New Roman" w:hAnsi="Times New Roman" w:cs="Times New Roman"/>
-                <w:sz w:val="24"/>
-                <w:szCs w:val="24"/>
-                <w:lang w:val="es-CO"/>
-              </w:rPr>
-              <w:t>(pedido);</w:t>
+              <w:t>listaGeneral.agregar(pedido);</w:t>
             </w:r>
           </w:p>
           <w:p>
@@ -3726,7 +2992,6 @@
                 <w:lang w:val="es-CO"/>
               </w:rPr>
             </w:pPr>
-            <w:proofErr w:type="spellStart"/>
             <w:r>
               <w:rPr>
                 <w:rFonts w:ascii="Times New Roman" w:hAnsi="Times New Roman" w:cs="Times New Roman"/>
@@ -3734,17 +2999,7 @@
                 <w:szCs w:val="24"/>
                 <w:lang w:val="es-CO"/>
               </w:rPr>
-              <w:t>colaPendientes.encolar</w:t>
-            </w:r>
-            <w:proofErr w:type="spellEnd"/>
-            <w:r>
-              <w:rPr>
-                <w:rFonts w:ascii="Times New Roman" w:hAnsi="Times New Roman" w:cs="Times New Roman"/>
-                <w:sz w:val="24"/>
-                <w:szCs w:val="24"/>
-                <w:lang w:val="es-CO"/>
-              </w:rPr>
-              <w:t>(pedido);</w:t>
+              <w:t>colaPendientes.encolar(pedido);</w:t>
             </w:r>
           </w:p>
           <w:p>
@@ -3758,7 +3013,6 @@
                 <w:lang w:val="es-CO"/>
               </w:rPr>
             </w:pPr>
-            <w:proofErr w:type="spellStart"/>
             <w:r>
               <w:rPr>
                 <w:rFonts w:ascii="Times New Roman" w:hAnsi="Times New Roman" w:cs="Times New Roman"/>
@@ -3766,17 +3020,7 @@
                 <w:szCs w:val="24"/>
                 <w:lang w:val="es-CO"/>
               </w:rPr>
-              <w:t>System.out.println</w:t>
-            </w:r>
-            <w:proofErr w:type="spellEnd"/>
-            <w:r>
-              <w:rPr>
-                <w:rFonts w:ascii="Times New Roman" w:hAnsi="Times New Roman" w:cs="Times New Roman"/>
-                <w:sz w:val="24"/>
-                <w:szCs w:val="24"/>
-                <w:lang w:val="es-CO"/>
-              </w:rPr>
-              <w:t>("Pedido registrado y enviado a la cola de pendientes.");</w:t>
+              <w:t>System.out.println("Pedido registrado y enviado a la cola de pendientes.");</w:t>
             </w:r>
           </w:p>
         </w:tc>
@@ -3836,27 +3080,7 @@
                 <w:szCs w:val="24"/>
                 <w:lang w:val="es-CO"/>
               </w:rPr>
-              <w:t xml:space="preserve">Pedido procesado = (Pedido) </w:t>
-            </w:r>
-            <w:proofErr w:type="spellStart"/>
-            <w:r>
-              <w:rPr>
-                <w:rFonts w:ascii="Times New Roman" w:hAnsi="Times New Roman" w:cs="Times New Roman"/>
-                <w:sz w:val="24"/>
-                <w:szCs w:val="24"/>
-                <w:lang w:val="es-CO"/>
-              </w:rPr>
-              <w:t>colaPendientes.desencolar</w:t>
-            </w:r>
-            <w:proofErr w:type="spellEnd"/>
-            <w:r>
-              <w:rPr>
-                <w:rFonts w:ascii="Times New Roman" w:hAnsi="Times New Roman" w:cs="Times New Roman"/>
-                <w:sz w:val="24"/>
-                <w:szCs w:val="24"/>
-                <w:lang w:val="es-CO"/>
-              </w:rPr>
-              <w:t>();</w:t>
+              <w:t>Pedido procesado = (Pedido) colaPendientes.desencolar();</w:t>
             </w:r>
           </w:p>
           <w:p>
@@ -3870,7 +3094,6 @@
                 <w:lang w:val="es-CO"/>
               </w:rPr>
             </w:pPr>
-            <w:proofErr w:type="spellStart"/>
             <w:r>
               <w:rPr>
                 <w:rFonts w:ascii="Times New Roman" w:hAnsi="Times New Roman" w:cs="Times New Roman"/>
@@ -3878,37 +3101,7 @@
                 <w:szCs w:val="24"/>
                 <w:lang w:val="es-CO"/>
               </w:rPr>
-              <w:t>if</w:t>
-            </w:r>
-            <w:proofErr w:type="spellEnd"/>
-            <w:r>
-              <w:rPr>
-                <w:rFonts w:ascii="Times New Roman" w:hAnsi="Times New Roman" w:cs="Times New Roman"/>
-                <w:sz w:val="24"/>
-                <w:szCs w:val="24"/>
-                <w:lang w:val="es-CO"/>
-              </w:rPr>
-              <w:t xml:space="preserve"> (procesado == </w:t>
-            </w:r>
-            <w:proofErr w:type="spellStart"/>
-            <w:r>
-              <w:rPr>
-                <w:rFonts w:ascii="Times New Roman" w:hAnsi="Times New Roman" w:cs="Times New Roman"/>
-                <w:sz w:val="24"/>
-                <w:szCs w:val="24"/>
-                <w:lang w:val="es-CO"/>
-              </w:rPr>
-              <w:t>null</w:t>
-            </w:r>
-            <w:proofErr w:type="spellEnd"/>
-            <w:r>
-              <w:rPr>
-                <w:rFonts w:ascii="Times New Roman" w:hAnsi="Times New Roman" w:cs="Times New Roman"/>
-                <w:sz w:val="24"/>
-                <w:szCs w:val="24"/>
-                <w:lang w:val="es-CO"/>
-              </w:rPr>
-              <w:t>) {</w:t>
+              <w:t>if (procesado == null) {</w:t>
             </w:r>
           </w:p>
           <w:p>
@@ -3929,27 +3122,7 @@
                 <w:szCs w:val="24"/>
                 <w:lang w:val="es-CO"/>
               </w:rPr>
-              <w:t xml:space="preserve">    </w:t>
-            </w:r>
-            <w:proofErr w:type="spellStart"/>
-            <w:r>
-              <w:rPr>
-                <w:rFonts w:ascii="Times New Roman" w:hAnsi="Times New Roman" w:cs="Times New Roman"/>
-                <w:sz w:val="24"/>
-                <w:szCs w:val="24"/>
-                <w:lang w:val="es-CO"/>
-              </w:rPr>
-              <w:t>System.out.println</w:t>
-            </w:r>
-            <w:proofErr w:type="spellEnd"/>
-            <w:r>
-              <w:rPr>
-                <w:rFonts w:ascii="Times New Roman" w:hAnsi="Times New Roman" w:cs="Times New Roman"/>
-                <w:sz w:val="24"/>
-                <w:szCs w:val="24"/>
-                <w:lang w:val="es-CO"/>
-              </w:rPr>
-              <w:t>("No hay pedidos pendientes por procesar.");</w:t>
+              <w:t xml:space="preserve">    System.out.println("No hay pedidos pendientes por procesar.");</w:t>
             </w:r>
           </w:p>
           <w:p>
@@ -3970,27 +3143,7 @@
                 <w:szCs w:val="24"/>
                 <w:lang w:val="es-CO"/>
               </w:rPr>
-              <w:t xml:space="preserve">    </w:t>
-            </w:r>
-            <w:proofErr w:type="spellStart"/>
-            <w:r>
-              <w:rPr>
-                <w:rFonts w:ascii="Times New Roman" w:hAnsi="Times New Roman" w:cs="Times New Roman"/>
-                <w:sz w:val="24"/>
-                <w:szCs w:val="24"/>
-                <w:lang w:val="es-CO"/>
-              </w:rPr>
-              <w:t>return</w:t>
-            </w:r>
-            <w:proofErr w:type="spellEnd"/>
-            <w:r>
-              <w:rPr>
-                <w:rFonts w:ascii="Times New Roman" w:hAnsi="Times New Roman" w:cs="Times New Roman"/>
-                <w:sz w:val="24"/>
-                <w:szCs w:val="24"/>
-                <w:lang w:val="es-CO"/>
-              </w:rPr>
-              <w:t>;</w:t>
+              <w:t xml:space="preserve">    return;</w:t>
             </w:r>
           </w:p>
           <w:p>
@@ -4025,8 +3178,6 @@
                 <w:lang w:val="es-CO"/>
               </w:rPr>
             </w:pPr>
-            <w:proofErr w:type="spellStart"/>
-            <w:proofErr w:type="gramStart"/>
             <w:r>
               <w:rPr>
                 <w:rFonts w:ascii="Times New Roman" w:hAnsi="Times New Roman" w:cs="Times New Roman"/>
@@ -4034,18 +3185,7 @@
                 <w:szCs w:val="24"/>
                 <w:lang w:val="es-CO"/>
               </w:rPr>
-              <w:t>procesado.setEstado</w:t>
-            </w:r>
-            <w:proofErr w:type="spellEnd"/>
-            <w:proofErr w:type="gramEnd"/>
-            <w:r>
-              <w:rPr>
-                <w:rFonts w:ascii="Times New Roman" w:hAnsi="Times New Roman" w:cs="Times New Roman"/>
-                <w:sz w:val="24"/>
-                <w:szCs w:val="24"/>
-                <w:lang w:val="es-CO"/>
-              </w:rPr>
-              <w:t>("PROCESADO");</w:t>
+              <w:t>procesado.setEstado("PROCESADO");</w:t>
             </w:r>
           </w:p>
           <w:p>
@@ -4059,7 +3199,6 @@
                 <w:lang w:val="es-CO"/>
               </w:rPr>
             </w:pPr>
-            <w:proofErr w:type="spellStart"/>
             <w:r>
               <w:rPr>
                 <w:rFonts w:ascii="Times New Roman" w:hAnsi="Times New Roman" w:cs="Times New Roman"/>
@@ -4067,17 +3206,7 @@
                 <w:szCs w:val="24"/>
                 <w:lang w:val="es-CO"/>
               </w:rPr>
-              <w:t>historialProcesados.apilar</w:t>
-            </w:r>
-            <w:proofErr w:type="spellEnd"/>
-            <w:r>
-              <w:rPr>
-                <w:rFonts w:ascii="Times New Roman" w:hAnsi="Times New Roman" w:cs="Times New Roman"/>
-                <w:sz w:val="24"/>
-                <w:szCs w:val="24"/>
-                <w:lang w:val="es-CO"/>
-              </w:rPr>
-              <w:t>(procesado);</w:t>
+              <w:t>historialProcesados.apilar(procesado);</w:t>
             </w:r>
           </w:p>
         </w:tc>
@@ -4098,33 +3227,8 @@
           <w:szCs w:val="24"/>
         </w:rPr>
         <w:lastRenderedPageBreak/>
-        <w:t xml:space="preserve">4.8 </w:t>
+        <w:t>4.8 Evidencia de ejecución</w:t>
       </w:r>
-      <w:proofErr w:type="spellStart"/>
-      <w:r>
-        <w:rPr>
-          <w:rFonts w:ascii="Times New Roman" w:hAnsi="Times New Roman" w:cs="Times New Roman"/>
-          <w:szCs w:val="24"/>
-        </w:rPr>
-        <w:t>Evidencia</w:t>
-      </w:r>
-      <w:proofErr w:type="spellEnd"/>
-      <w:r>
-        <w:rPr>
-          <w:rFonts w:ascii="Times New Roman" w:hAnsi="Times New Roman" w:cs="Times New Roman"/>
-          <w:szCs w:val="24"/>
-        </w:rPr>
-        <w:t xml:space="preserve"> de </w:t>
-      </w:r>
-      <w:proofErr w:type="spellStart"/>
-      <w:r>
-        <w:rPr>
-          <w:rFonts w:ascii="Times New Roman" w:hAnsi="Times New Roman" w:cs="Times New Roman"/>
-          <w:szCs w:val="24"/>
-        </w:rPr>
-        <w:t>ejecución</w:t>
-      </w:r>
-      <w:proofErr w:type="spellEnd"/>
     </w:p>
     <w:p>
       <w:pPr>
@@ -4273,25 +3377,7 @@
           <w:szCs w:val="24"/>
           <w:lang w:val="es-CO"/>
         </w:rPr>
-        <w:t xml:space="preserve">El código fuente debe publicarse en un repositorio público de GitHub. Para cumplir la exigencia de evidencia de construcción, el repositorio debe mostrar </w:t>
-      </w:r>
-      <w:proofErr w:type="spellStart"/>
-      <w:r>
-        <w:rPr>
-          <w:rFonts w:cs="Times New Roman"/>
-          <w:szCs w:val="24"/>
-          <w:lang w:val="es-CO"/>
-        </w:rPr>
-        <w:t>commits</w:t>
-      </w:r>
-      <w:proofErr w:type="spellEnd"/>
-      <w:r>
-        <w:rPr>
-          <w:rFonts w:cs="Times New Roman"/>
-          <w:szCs w:val="24"/>
-          <w:lang w:val="es-CO"/>
-        </w:rPr>
-        <w:t xml:space="preserve"> progresivos, mensajes descriptivos y evolución real del desarrollo. En este espacio se debe pegar el enlace definitivo después de subir el proyecto:</w:t>
+        <w:t>El código fuente debe publicarse en un repositorio público de GitHub. Para cumplir la exigencia de evidencia de construcción, el repositorio debe mostrar commits progresivos, mensajes descriptivos y evolución real del desarrollo. En este espacio se debe pegar el enlace definitivo después de subir el proyecto:</w:t>
       </w:r>
     </w:p>
     <w:p>
@@ -4328,7 +3414,15 @@
           <w:szCs w:val="24"/>
           <w:lang w:val="es-CO"/>
         </w:rPr>
-        <w:t>7. Conclusiones</w:t>
+        <w:t>6</w:t>
+      </w:r>
+      <w:r>
+        <w:rPr>
+          <w:rFonts w:ascii="Times New Roman" w:hAnsi="Times New Roman" w:cs="Times New Roman"/>
+          <w:szCs w:val="24"/>
+          <w:lang w:val="es-CO"/>
+        </w:rPr>
+        <w:t>. Conclusiones</w:t>
       </w:r>
     </w:p>
     <w:p>
@@ -4382,43 +3476,7 @@
           <w:szCs w:val="24"/>
           <w:lang w:val="es-CO"/>
         </w:rPr>
-        <w:t xml:space="preserve">El sistema también fortaleció el manejo de validaciones, </w:t>
-      </w:r>
-      <w:proofErr w:type="spellStart"/>
-      <w:r>
-        <w:rPr>
-          <w:rFonts w:cs="Times New Roman"/>
-          <w:szCs w:val="24"/>
-          <w:lang w:val="es-CO"/>
-        </w:rPr>
-        <w:t>modularización</w:t>
-      </w:r>
-      <w:proofErr w:type="spellEnd"/>
-      <w:r>
-        <w:rPr>
-          <w:rFonts w:cs="Times New Roman"/>
-          <w:szCs w:val="24"/>
-          <w:lang w:val="es-CO"/>
-        </w:rPr>
-        <w:t xml:space="preserve"> y separación de responsabilidades. La clase Pedido modela los datos, las estructuras administran el almacenamiento y </w:t>
-      </w:r>
-      <w:proofErr w:type="spellStart"/>
-      <w:r>
-        <w:rPr>
-          <w:rFonts w:cs="Times New Roman"/>
-          <w:szCs w:val="24"/>
-          <w:lang w:val="es-CO"/>
-        </w:rPr>
-        <w:t>SistemaRestaurante</w:t>
-      </w:r>
-      <w:proofErr w:type="spellEnd"/>
-      <w:r>
-        <w:rPr>
-          <w:rFonts w:cs="Times New Roman"/>
-          <w:szCs w:val="24"/>
-          <w:lang w:val="es-CO"/>
-        </w:rPr>
-        <w:t xml:space="preserve"> coordina el flujo de interacción con el usuario.</w:t>
+        <w:t>El sistema también fortaleció el manejo de validaciones, modularización y separación de responsabilidades. La clase Pedido modela los datos, las estructuras administran el almacenamiento y SistemaRestaurante coordina el flujo de interacción con el usuario.</w:t>
       </w:r>
     </w:p>
     <w:p>
@@ -4435,7 +3493,14 @@
           <w:rFonts w:ascii="Times New Roman" w:hAnsi="Times New Roman" w:cs="Times New Roman"/>
           <w:szCs w:val="24"/>
         </w:rPr>
-        <w:t>8. Referencias</w:t>
+        <w:t>7</w:t>
+      </w:r>
+      <w:r>
+        <w:rPr>
+          <w:rFonts w:ascii="Times New Roman" w:hAnsi="Times New Roman" w:cs="Times New Roman"/>
+          <w:szCs w:val="24"/>
+        </w:rPr>
+        <w:t>. Referencias</w:t>
       </w:r>
     </w:p>
     <w:p>

</xml_diff>